<commit_message>
Mejoras importantes en la interfaz de la aplicacion, script funcionales y mejorados.
</commit_message>
<xml_diff>
--- a/manual_tecnico.docx
+++ b/manual_tecnico.docx
@@ -31,7 +31,7 @@
           <w:color w:val="606060"/>
           <w:sz w:val="20"/>
         </w:rPr>
-        <w:t>Versión 1.0 — 28 de septiembre de 2026</w:t>
+        <w:t>Versión 1.1 — 3 de octubre de 2026</w:t>
       </w:r>
     </w:p>
     <w:p/>
@@ -792,6 +792,38 @@
           </w:p>
         </w:tc>
       </w:tr>
+      <w:tr>
+        <w:tc>
+          <w:tcPr>
+            <w:tcW w:type="dxa" w:w="2880"/>
+          </w:tcPr>
+          <w:p>
+            <w:r>
+              <w:t>comparacion.py</w:t>
+            </w:r>
+          </w:p>
+        </w:tc>
+        <w:tc>
+          <w:tcPr>
+            <w:tcW w:type="dxa" w:w="2880"/>
+          </w:tcPr>
+          <w:p>
+            <w:r>
+              <w:t>Comparación numérica de latitud, longitud, profundidad y magnitud a la precisión del flujo; la usan compara.py y revisa_seiscomp.py.</w:t>
+            </w:r>
+          </w:p>
+        </w:tc>
+        <w:tc>
+          <w:tcPr>
+            <w:tcW w:type="dxa" w:w="2880"/>
+          </w:tcPr>
+          <w:p>
+            <w:r>
+              <w:t>—</w:t>
+            </w:r>
+          </w:p>
+        </w:tc>
+      </w:tr>
     </w:tbl>
     <w:p/>
     <w:tbl>
@@ -1896,7 +1928,7 @@
     </w:p>
     <w:p>
       <w:r>
-        <w:t>El botón de análisis ejecuta una secuencia fija de etapas. La barra de progreso reparte el avance entre ellas según los pesos declarados en ANALISIS_PLAN, y la etapa activa se determina comparando el nombre del script que se está lanzando con el campo scripts de cada entrada del plan.</w:t>
+        <w:t>El botón «Procesar catálogos» ejecuta una secuencia fija de etapas. La barra de progreso reparte el avance según los pesos declarados en PROCESAR_PLAN (que incluye el análisis y la generación de paneles) y la etapa activa se determina comparando el nombre del script que se lanza con el campo scripts de cada entrada, desempatando por el discriminador cuando un mismo script corre más de una vez.</w:t>
       </w:r>
     </w:p>
     <w:tbl>
@@ -1918,12 +1950,7 @@
             <w:tcW w:type="dxa" w:w="1728"/>
           </w:tcPr>
           <w:p>
-            <w:r/>
-            <w:r>
-              <w:rPr>
-                <w:b/>
-                <w:sz w:val="18"/>
-              </w:rPr>
+            <w:r>
               <w:t>#</w:t>
             </w:r>
           </w:p>
@@ -1933,12 +1960,7 @@
             <w:tcW w:type="dxa" w:w="1728"/>
           </w:tcPr>
           <w:p>
-            <w:r/>
-            <w:r>
-              <w:rPr>
-                <w:b/>
-                <w:sz w:val="18"/>
-              </w:rPr>
+            <w:r>
               <w:t>Etiqueta en pantalla</w:t>
             </w:r>
           </w:p>
@@ -1948,12 +1970,7 @@
             <w:tcW w:type="dxa" w:w="1728"/>
           </w:tcPr>
           <w:p>
-            <w:r/>
-            <w:r>
-              <w:rPr>
-                <w:b/>
-                <w:sz w:val="18"/>
-              </w:rPr>
+            <w:r>
               <w:t>Script</w:t>
             </w:r>
           </w:p>
@@ -1963,12 +1980,7 @@
             <w:tcW w:type="dxa" w:w="1728"/>
           </w:tcPr>
           <w:p>
-            <w:r/>
-            <w:r>
-              <w:rPr>
-                <w:b/>
-                <w:sz w:val="18"/>
-              </w:rPr>
+            <w:r>
               <w:t>Peso</w:t>
             </w:r>
           </w:p>
@@ -1978,12 +1990,7 @@
             <w:tcW w:type="dxa" w:w="1728"/>
           </w:tcPr>
           <w:p>
-            <w:r/>
-            <w:r>
-              <w:rPr>
-                <w:b/>
-                <w:sz w:val="18"/>
-              </w:rPr>
+            <w:r>
               <w:t>Qué produce</w:t>
             </w:r>
           </w:p>
@@ -1995,11 +2002,7 @@
             <w:tcW w:type="dxa" w:w="1728"/>
           </w:tcPr>
           <w:p>
-            <w:r/>
-            <w:r>
-              <w:rPr>
-                <w:sz w:val="18"/>
-              </w:rPr>
+            <w:r>
               <w:t>1</w:t>
             </w:r>
           </w:p>
@@ -2009,11 +2012,7 @@
             <w:tcW w:type="dxa" w:w="1728"/>
           </w:tcPr>
           <w:p>
-            <w:r/>
-            <w:r>
-              <w:rPr>
-                <w:sz w:val="18"/>
-              </w:rPr>
+            <w:r>
               <w:t>Procesando query</w:t>
             </w:r>
           </w:p>
@@ -2023,11 +2022,7 @@
             <w:tcW w:type="dxa" w:w="1728"/>
           </w:tcPr>
           <w:p>
-            <w:r/>
-            <w:r>
-              <w:rPr>
-                <w:sz w:val="18"/>
-              </w:rPr>
+            <w:r>
               <w:t>proc_query_harz_2.py</w:t>
             </w:r>
           </w:p>
@@ -2037,12 +2032,8 @@
             <w:tcW w:type="dxa" w:w="1728"/>
           </w:tcPr>
           <w:p>
-            <w:r/>
-            <w:r>
-              <w:rPr>
-                <w:sz w:val="18"/>
-              </w:rPr>
-              <w:t>10 %</w:t>
+            <w:r>
+              <w:t>7.5 %</w:t>
             </w:r>
           </w:p>
         </w:tc>
@@ -2051,11 +2042,7 @@
             <w:tcW w:type="dxa" w:w="1728"/>
           </w:tcPr>
           <w:p>
-            <w:r/>
-            <w:r>
-              <w:rPr>
-                <w:sz w:val="18"/>
-              </w:rPr>
+            <w:r>
               <w:t>datos/new_&lt;base&gt;.csv, datos/new_2_&lt;base&gt;.csv y el .dat</w:t>
             </w:r>
           </w:p>
@@ -2067,11 +2054,7 @@
             <w:tcW w:type="dxa" w:w="1728"/>
           </w:tcPr>
           <w:p>
-            <w:r/>
-            <w:r>
-              <w:rPr>
-                <w:sz w:val="18"/>
-              </w:rPr>
+            <w:r>
               <w:t>2</w:t>
             </w:r>
           </w:p>
@@ -2081,11 +2064,7 @@
             <w:tcW w:type="dxa" w:w="1728"/>
           </w:tcPr>
           <w:p>
-            <w:r/>
-            <w:r>
-              <w:rPr>
-                <w:sz w:val="18"/>
-              </w:rPr>
+            <w:r>
               <w:t>Revisando select</w:t>
             </w:r>
           </w:p>
@@ -2095,11 +2074,7 @@
             <w:tcW w:type="dxa" w:w="1728"/>
           </w:tcPr>
           <w:p>
-            <w:r/>
-            <w:r>
-              <w:rPr>
-                <w:sz w:val="18"/>
-              </w:rPr>
+            <w:r>
               <w:t>revisaselect.py</w:t>
             </w:r>
           </w:p>
@@ -2109,12 +2084,8 @@
             <w:tcW w:type="dxa" w:w="1728"/>
           </w:tcPr>
           <w:p>
-            <w:r/>
-            <w:r>
-              <w:rPr>
-                <w:sz w:val="18"/>
-              </w:rPr>
-              <w:t>15 %</w:t>
+            <w:r>
+              <w:t>11 %</w:t>
             </w:r>
           </w:p>
         </w:tc>
@@ -2123,11 +2094,7 @@
             <w:tcW w:type="dxa" w:w="1728"/>
           </w:tcPr>
           <w:p>
-            <w:r/>
-            <w:r>
-              <w:rPr>
-                <w:sz w:val="18"/>
-              </w:rPr>
+            <w:r>
               <w:t>trabajo/newcollect.txt, informes/excluidos.txt</w:t>
             </w:r>
           </w:p>
@@ -2139,11 +2106,7 @@
             <w:tcW w:type="dxa" w:w="1728"/>
           </w:tcPr>
           <w:p>
-            <w:r/>
-            <w:r>
-              <w:rPr>
-                <w:sz w:val="18"/>
-              </w:rPr>
+            <w:r>
               <w:t>3</w:t>
             </w:r>
           </w:p>
@@ -2153,11 +2116,7 @@
             <w:tcW w:type="dxa" w:w="1728"/>
           </w:tcPr>
           <w:p>
-            <w:r/>
-            <w:r>
-              <w:rPr>
-                <w:sz w:val="18"/>
-              </w:rPr>
+            <w:r>
               <w:t>Revisando collect</w:t>
             </w:r>
           </w:p>
@@ -2167,11 +2126,7 @@
             <w:tcW w:type="dxa" w:w="1728"/>
           </w:tcPr>
           <w:p>
-            <w:r/>
-            <w:r>
-              <w:rPr>
-                <w:sz w:val="18"/>
-              </w:rPr>
+            <w:r>
               <w:t>revisacollect.py</w:t>
             </w:r>
           </w:p>
@@ -2181,12 +2136,8 @@
             <w:tcW w:type="dxa" w:w="1728"/>
           </w:tcPr>
           <w:p>
-            <w:r/>
-            <w:r>
-              <w:rPr>
-                <w:sz w:val="18"/>
-              </w:rPr>
-              <w:t>15 %</w:t>
+            <w:r>
+              <w:t>11 %</w:t>
             </w:r>
           </w:p>
         </w:tc>
@@ -2195,11 +2146,7 @@
             <w:tcW w:type="dxa" w:w="1728"/>
           </w:tcPr>
           <w:p>
-            <w:r/>
-            <w:r>
-              <w:rPr>
-                <w:sz w:val="18"/>
-              </w:rPr>
+            <w:r>
               <w:t>datos/salida_collect.csv y los CSV por analista</w:t>
             </w:r>
           </w:p>
@@ -2211,11 +2158,7 @@
             <w:tcW w:type="dxa" w:w="1728"/>
           </w:tcPr>
           <w:p>
-            <w:r/>
-            <w:r>
-              <w:rPr>
-                <w:sz w:val="18"/>
-              </w:rPr>
+            <w:r>
               <w:t>4</w:t>
             </w:r>
           </w:p>
@@ -2225,11 +2168,7 @@
             <w:tcW w:type="dxa" w:w="1728"/>
           </w:tcPr>
           <w:p>
-            <w:r/>
-            <w:r>
-              <w:rPr>
-                <w:sz w:val="18"/>
-              </w:rPr>
+            <w:r>
               <w:t>Comparando publicados v/s procesados</w:t>
             </w:r>
           </w:p>
@@ -2239,11 +2178,7 @@
             <w:tcW w:type="dxa" w:w="1728"/>
           </w:tcPr>
           <w:p>
-            <w:r/>
-            <w:r>
-              <w:rPr>
-                <w:sz w:val="18"/>
-              </w:rPr>
+            <w:r>
               <w:t>compara.py</w:t>
             </w:r>
           </w:p>
@@ -2253,12 +2188,8 @@
             <w:tcW w:type="dxa" w:w="1728"/>
           </w:tcPr>
           <w:p>
-            <w:r/>
-            <w:r>
-              <w:rPr>
-                <w:sz w:val="18"/>
-              </w:rPr>
-              <w:t>25 %</w:t>
+            <w:r>
+              <w:t>15 %</w:t>
             </w:r>
           </w:p>
         </w:tc>
@@ -2267,11 +2198,7 @@
             <w:tcW w:type="dxa" w:w="1728"/>
           </w:tcPr>
           <w:p>
-            <w:r/>
-            <w:r>
-              <w:rPr>
-                <w:sz w:val="18"/>
-              </w:rPr>
+            <w:r>
               <w:t>Los cuatro reportes de no publicados y no actualizados</w:t>
             </w:r>
           </w:p>
@@ -2283,11 +2210,7 @@
             <w:tcW w:type="dxa" w:w="1728"/>
           </w:tcPr>
           <w:p>
-            <w:r/>
-            <w:r>
-              <w:rPr>
-                <w:sz w:val="18"/>
-              </w:rPr>
+            <w:r>
               <w:t>5</w:t>
             </w:r>
           </w:p>
@@ -2297,12 +2220,8 @@
             <w:tcW w:type="dxa" w:w="1728"/>
           </w:tcPr>
           <w:p>
-            <w:r/>
-            <w:r>
-              <w:rPr>
-                <w:sz w:val="18"/>
-              </w:rPr>
-              <w:t>Revisando excluidos</w:t>
+            <w:r>
+              <w:t>Convirtiendo SeisComp</w:t>
             </w:r>
           </w:p>
         </w:tc>
@@ -2311,12 +2230,8 @@
             <w:tcW w:type="dxa" w:w="1728"/>
           </w:tcPr>
           <w:p>
-            <w:r/>
-            <w:r>
-              <w:rPr>
-                <w:sz w:val="18"/>
-              </w:rPr>
-              <w:t>revisaexcluidos.py, repetidosexclu.py</w:t>
+            <w:r>
+              <w:t>seiscomp_a_parametros.py</w:t>
             </w:r>
           </w:p>
         </w:tc>
@@ -2325,12 +2240,8 @@
             <w:tcW w:type="dxa" w:w="1728"/>
           </w:tcPr>
           <w:p>
-            <w:r/>
-            <w:r>
-              <w:rPr>
-                <w:sz w:val="18"/>
-              </w:rPr>
-              <w:t>10 %</w:t>
+            <w:r>
+              <w:t>4 %</w:t>
             </w:r>
           </w:p>
         </w:tc>
@@ -2339,12 +2250,8 @@
             <w:tcW w:type="dxa" w:w="1728"/>
           </w:tcPr>
           <w:p>
-            <w:r/>
-            <w:r>
-              <w:rPr>
-                <w:sz w:val="18"/>
-              </w:rPr>
-              <w:t>datos/excluidos.csv e informes/rep_seisan_exclu.txt</w:t>
+            <w:r>
+              <w:t>datos/seiscomp_parametros.csv</w:t>
             </w:r>
           </w:p>
         </w:tc>
@@ -2355,11 +2262,7 @@
             <w:tcW w:type="dxa" w:w="1728"/>
           </w:tcPr>
           <w:p>
-            <w:r/>
-            <w:r>
-              <w:rPr>
-                <w:sz w:val="18"/>
-              </w:rPr>
+            <w:r>
               <w:t>6</w:t>
             </w:r>
           </w:p>
@@ -2369,11 +2272,111 @@
             <w:tcW w:type="dxa" w:w="1728"/>
           </w:tcPr>
           <w:p>
-            <w:r/>
-            <w:r>
-              <w:rPr>
-                <w:sz w:val="18"/>
-              </w:rPr>
+            <w:r>
+              <w:t>Atribuyendo publicados a SeisComp</w:t>
+            </w:r>
+          </w:p>
+        </w:tc>
+        <w:tc>
+          <w:tcPr>
+            <w:tcW w:type="dxa" w:w="1728"/>
+          </w:tcPr>
+          <w:p>
+            <w:r>
+              <w:t>compara.py (seiscomp_)</w:t>
+            </w:r>
+          </w:p>
+        </w:tc>
+        <w:tc>
+          <w:tcPr>
+            <w:tcW w:type="dxa" w:w="1728"/>
+          </w:tcPr>
+          <w:p>
+            <w:r>
+              <w:t>7.5 %</w:t>
+            </w:r>
+          </w:p>
+        </w:tc>
+        <w:tc>
+          <w:tcPr>
+            <w:tcW w:type="dxa" w:w="1728"/>
+          </w:tcPr>
+          <w:p>
+            <w:r>
+              <w:t>informes/no_act_seiscomp_*.txt y datos/atribucion_seiscomp.csv</w:t>
+            </w:r>
+          </w:p>
+        </w:tc>
+      </w:tr>
+      <w:tr>
+        <w:tc>
+          <w:tcPr>
+            <w:tcW w:type="dxa" w:w="1728"/>
+          </w:tcPr>
+          <w:p>
+            <w:r>
+              <w:t>7</w:t>
+            </w:r>
+          </w:p>
+        </w:tc>
+        <w:tc>
+          <w:tcPr>
+            <w:tcW w:type="dxa" w:w="1728"/>
+          </w:tcPr>
+          <w:p>
+            <w:r>
+              <w:t>Revisando excluidos</w:t>
+            </w:r>
+          </w:p>
+        </w:tc>
+        <w:tc>
+          <w:tcPr>
+            <w:tcW w:type="dxa" w:w="1728"/>
+          </w:tcPr>
+          <w:p>
+            <w:r>
+              <w:t>revisaexcluidos.py, repetidosexclu.py</w:t>
+            </w:r>
+          </w:p>
+        </w:tc>
+        <w:tc>
+          <w:tcPr>
+            <w:tcW w:type="dxa" w:w="1728"/>
+          </w:tcPr>
+          <w:p>
+            <w:r>
+              <w:t>7.5 %</w:t>
+            </w:r>
+          </w:p>
+        </w:tc>
+        <w:tc>
+          <w:tcPr>
+            <w:tcW w:type="dxa" w:w="1728"/>
+          </w:tcPr>
+          <w:p>
+            <w:r>
+              <w:t>datos/excluidos.csv e informes/rep_seisan_exclu.txt</w:t>
+            </w:r>
+          </w:p>
+        </w:tc>
+      </w:tr>
+      <w:tr>
+        <w:tc>
+          <w:tcPr>
+            <w:tcW w:type="dxa" w:w="1728"/>
+          </w:tcPr>
+          <w:p>
+            <w:r>
+              <w:t>8</w:t>
+            </w:r>
+          </w:p>
+        </w:tc>
+        <w:tc>
+          <w:tcPr>
+            <w:tcW w:type="dxa" w:w="1728"/>
+          </w:tcPr>
+          <w:p>
+            <w:r>
               <w:t>Revisando repetidos</w:t>
             </w:r>
           </w:p>
@@ -2383,11 +2386,7 @@
             <w:tcW w:type="dxa" w:w="1728"/>
           </w:tcPr>
           <w:p>
-            <w:r/>
-            <w:r>
-              <w:rPr>
-                <w:sz w:val="18"/>
-              </w:rPr>
+            <w:r>
               <w:t>repetidos.py</w:t>
             </w:r>
           </w:p>
@@ -2397,12 +2396,8 @@
             <w:tcW w:type="dxa" w:w="1728"/>
           </w:tcPr>
           <w:p>
-            <w:r/>
-            <w:r>
-              <w:rPr>
-                <w:sz w:val="18"/>
-              </w:rPr>
-              <w:t>25 %</w:t>
+            <w:r>
+              <w:t>11.5 %</w:t>
             </w:r>
           </w:p>
         </w:tc>
@@ -2411,12 +2406,60 @@
             <w:tcW w:type="dxa" w:w="1728"/>
           </w:tcPr>
           <w:p>
-            <w:r/>
-            <w:r>
-              <w:rPr>
-                <w:sz w:val="18"/>
-              </w:rPr>
-              <w:t>Los cuatro reportes de repetidos</w:t>
+            <w:r>
+              <w:t>Los reportes de repetidos</w:t>
+            </w:r>
+          </w:p>
+        </w:tc>
+      </w:tr>
+      <w:tr>
+        <w:tc>
+          <w:tcPr>
+            <w:tcW w:type="dxa" w:w="1728"/>
+          </w:tcPr>
+          <w:p>
+            <w:r>
+              <w:t>9</w:t>
+            </w:r>
+          </w:p>
+        </w:tc>
+        <w:tc>
+          <w:tcPr>
+            <w:tcW w:type="dxa" w:w="1728"/>
+          </w:tcPr>
+          <w:p>
+            <w:r>
+              <w:t>Generando paneles (5 etapas)</w:t>
+            </w:r>
+          </w:p>
+        </w:tc>
+        <w:tc>
+          <w:tcPr>
+            <w:tcW w:type="dxa" w:w="1728"/>
+          </w:tcPr>
+          <w:p>
+            <w:r>
+              <w:t>generajson.py</w:t>
+            </w:r>
+          </w:p>
+        </w:tc>
+        <w:tc>
+          <w:tcPr>
+            <w:tcW w:type="dxa" w:w="1728"/>
+          </w:tcPr>
+          <w:p>
+            <w:r>
+              <w:t>25 % en total</w:t>
+            </w:r>
+          </w:p>
+        </w:tc>
+        <w:tc>
+          <w:tcPr>
+            <w:tcW w:type="dxa" w:w="1728"/>
+          </w:tcPr>
+          <w:p>
+            <w:r>
+              <w:t>datos/eventos_&lt;fuente&gt;.json de cada fuente</w:t>
             </w:r>
           </w:p>
         </w:tc>
@@ -2467,7 +2510,7 @@
     </w:p>
     <w:p>
       <w:r>
-        <w:t>Terminado el análisis, los botones de fuente generan el JSON de eventos con su perfil asignado y abren el panel de mapas. Los tres comandos difieren solo en el CSV de partida y en el nombre de la fuente, que a su vez determina el nombre de los archivos de salida.</w:t>
+        <w:t>Terminado el análisis, el mismo botón «Procesar catálogos» genera el JSON de eventos con su perfil asignado de todas las fuentes y deja los paneles listos. La generación es perezosa al abrir una pestaña cuando el JSON falta o quedó viejo. Los comandos difieren solo en el CSV de partida y en el nombre de la fuente, que determina los archivos de salida.</w:t>
       </w:r>
     </w:p>
     <w:tbl>
@@ -2487,13 +2530,8 @@
             <w:tcW w:type="dxa" w:w="2880"/>
           </w:tcPr>
           <w:p>
-            <w:r/>
-            <w:r>
-              <w:rPr>
-                <w:b/>
-                <w:sz w:val="18"/>
-              </w:rPr>
-              <w:t>Botón</w:t>
+            <w:r>
+              <w:t>Fuente</w:t>
             </w:r>
           </w:p>
         </w:tc>
@@ -2502,12 +2540,7 @@
             <w:tcW w:type="dxa" w:w="2880"/>
           </w:tcPr>
           <w:p>
-            <w:r/>
-            <w:r>
-              <w:rPr>
-                <w:b/>
-                <w:sz w:val="18"/>
-              </w:rPr>
+            <w:r>
               <w:t>Comando</w:t>
             </w:r>
           </w:p>
@@ -2517,12 +2550,7 @@
             <w:tcW w:type="dxa" w:w="2880"/>
           </w:tcPr>
           <w:p>
-            <w:r/>
-            <w:r>
-              <w:rPr>
-                <w:b/>
-                <w:sz w:val="18"/>
-              </w:rPr>
+            <w:r>
               <w:t>Salida</w:t>
             </w:r>
           </w:p>
@@ -2534,12 +2562,8 @@
             <w:tcW w:type="dxa" w:w="2880"/>
           </w:tcPr>
           <w:p>
-            <w:r/>
-            <w:r>
-              <w:rPr>
-                <w:sz w:val="18"/>
-              </w:rPr>
-              <w:t>Datos de Seisan</w:t>
+            <w:r>
+              <w:t>Seisan</w:t>
             </w:r>
           </w:p>
         </w:tc>
@@ -2548,11 +2572,7 @@
             <w:tcW w:type="dxa" w:w="2880"/>
           </w:tcPr>
           <w:p>
-            <w:r/>
-            <w:r>
-              <w:rPr>
-                <w:sz w:val="18"/>
-              </w:rPr>
+            <w:r>
               <w:t>generajson.py datos/salida_collect.csv seisan</w:t>
             </w:r>
           </w:p>
@@ -2562,11 +2582,7 @@
             <w:tcW w:type="dxa" w:w="2880"/>
           </w:tcPr>
           <w:p>
-            <w:r/>
-            <w:r>
-              <w:rPr>
-                <w:sz w:val="18"/>
-              </w:rPr>
+            <w:r>
               <w:t>eventos_seisan.json</w:t>
             </w:r>
           </w:p>
@@ -2578,12 +2594,8 @@
             <w:tcW w:type="dxa" w:w="2880"/>
           </w:tcPr>
           <w:p>
-            <w:r/>
-            <w:r>
-              <w:rPr>
-                <w:sz w:val="18"/>
-              </w:rPr>
-              <w:t>Datos de eventquery</w:t>
+            <w:r>
+              <w:t>eventquery</w:t>
             </w:r>
           </w:p>
         </w:tc>
@@ -2592,11 +2604,7 @@
             <w:tcW w:type="dxa" w:w="2880"/>
           </w:tcPr>
           <w:p>
-            <w:r/>
-            <w:r>
-              <w:rPr>
-                <w:sz w:val="18"/>
-              </w:rPr>
+            <w:r>
               <w:t>concatena datos/new_2_*.csv y ejecuta generajson.py datos/todos_eventquery.csv eventquery</w:t>
             </w:r>
           </w:p>
@@ -2606,11 +2614,7 @@
             <w:tcW w:type="dxa" w:w="2880"/>
           </w:tcPr>
           <w:p>
-            <w:r/>
-            <w:r>
-              <w:rPr>
-                <w:sz w:val="18"/>
-              </w:rPr>
+            <w:r>
               <w:t>eventos_eventquery.json</w:t>
             </w:r>
           </w:p>
@@ -2622,11 +2626,39 @@
             <w:tcW w:type="dxa" w:w="2880"/>
           </w:tcPr>
           <w:p>
-            <w:r/>
-            <w:r>
-              <w:rPr>
-                <w:sz w:val="18"/>
-              </w:rPr>
+            <w:r>
+              <w:t>SeisComp</w:t>
+            </w:r>
+          </w:p>
+        </w:tc>
+        <w:tc>
+          <w:tcPr>
+            <w:tcW w:type="dxa" w:w="2880"/>
+          </w:tcPr>
+          <w:p>
+            <w:r>
+              <w:t>generajson.py datos/seiscomp_parametros.csv seiscomp</w:t>
+            </w:r>
+          </w:p>
+        </w:tc>
+        <w:tc>
+          <w:tcPr>
+            <w:tcW w:type="dxa" w:w="2880"/>
+          </w:tcPr>
+          <w:p>
+            <w:r>
+              <w:t>eventos_seiscomp.json</w:t>
+            </w:r>
+          </w:p>
+        </w:tc>
+      </w:tr>
+      <w:tr>
+        <w:tc>
+          <w:tcPr>
+            <w:tcW w:type="dxa" w:w="2880"/>
+          </w:tcPr>
+          <w:p>
+            <w:r>
               <w:t>No publicados de Seisan</w:t>
             </w:r>
           </w:p>
@@ -2636,12 +2668,8 @@
             <w:tcW w:type="dxa" w:w="2880"/>
           </w:tcPr>
           <w:p>
-            <w:r/>
-            <w:r>
-              <w:rPr>
-                <w:sz w:val="18"/>
-              </w:rPr>
-              <w:t>generajson.py datos/no_pub_desde_2_5_estricto.csv seisan</w:t>
+            <w:r>
+              <w:t>generajson.py datos/no_pub_desde_2_5_estricto.csv seisan --salida=seisan_nopub</w:t>
             </w:r>
           </w:p>
         </w:tc>
@@ -2650,12 +2678,40 @@
             <w:tcW w:type="dxa" w:w="2880"/>
           </w:tcPr>
           <w:p>
-            <w:r/>
-            <w:r>
-              <w:rPr>
-                <w:sz w:val="18"/>
-              </w:rPr>
-              <w:t>Sobrescribe eventos_seisan.json</w:t>
+            <w:r>
+              <w:t>eventos_seisan_nopub.json</w:t>
+            </w:r>
+          </w:p>
+        </w:tc>
+      </w:tr>
+      <w:tr>
+        <w:tc>
+          <w:tcPr>
+            <w:tcW w:type="dxa" w:w="2880"/>
+          </w:tcPr>
+          <w:p>
+            <w:r>
+              <w:t>No publicados de SeisComp</w:t>
+            </w:r>
+          </w:p>
+        </w:tc>
+        <w:tc>
+          <w:tcPr>
+            <w:tcW w:type="dxa" w:w="2880"/>
+          </w:tcPr>
+          <w:p>
+            <w:r>
+              <w:t>generajson.py datos/no_pub_desde_2_5_seiscomp_estricto.csv seiscomp --salida=seiscomp_nopub</w:t>
+            </w:r>
+          </w:p>
+        </w:tc>
+        <w:tc>
+          <w:tcPr>
+            <w:tcW w:type="dxa" w:w="2880"/>
+          </w:tcPr>
+          <w:p>
+            <w:r>
+              <w:t>eventos_seiscomp_nopub.json</w:t>
             </w:r>
           </w:p>
         </w:tc>
@@ -2664,7 +2720,7 @@
     <w:p/>
     <w:p>
       <w:r>
-        <w:t>Dos advertencias importantes. Primera: la fuente no publicados usa el nombre seisan, por lo que sobrescribe el JSON de la fuente de Seisan; conviene revisar los no publicados antes de generar sobre ellos. Segunda: la concatenación de eventquery suma varios archivos de entrada en uno solo, de modo que el número de eventos del catálogo público puede superar al de una corrida individual.</w:t>
+        <w:t>La concatenación de eventquery suma varios archivos de entrada en uno solo, de modo que el número de eventos del catálogo público puede superar al de una corrida individual. Los no publicados tienen su propio JSON (--salida), así que ya no pisan el de la fuente principal.</w:t>
       </w:r>
     </w:p>
     <w:p>
@@ -6007,12 +6063,13 @@
             <w:tcW w:type="dxa" w:w="4320"/>
           </w:tcPr>
           <w:p>
-            <w:r/>
-            <w:r>
-              <w:rPr>
-                <w:sz w:val="18"/>
-              </w:rPr>
-              <w:t>Compara el catálogo público contra el select con dos filtros. Marca como no publicado el evento sin coincidencia temporal, y como no actualizado el que coincide pero difiere en posición o profundidad. Además aísla los de magnitud 2.5 o superior.</w:t>
+            <w:r>
+              <w:t>Compara el catálogo público contra el select con dos filtros. Marca como no publicado el evento sin coincidencia temporal, y como no actualizado el que coincide pero difiere en latitud, longitud, profundidad o magnitud, comparando numéricamente a la precisión del flujo (3 decimales en coordenadas; 1 en profundidad y magnitud) mediante comparacion.py. Además aísla los de magnitud 2.5 o superior. Escribe la atribución por analista y, si una corrida no deja no publicados ni cruces, borra los CSV viejos para que no se muestren datos de una corrida anterior.</w:t>
+            </w:r>
+            <w:r>
+              <w:rPr>
+                <w:sz w:val="18"/>
+              </w:rPr>
             </w:r>
           </w:p>
         </w:tc>
@@ -6386,13 +6443,14 @@
             <w:tcW w:type="dxa" w:w="2880"/>
           </w:tcPr>
           <w:p>
-            <w:r/>
-            <w:r>
-              <w:rPr>
-                <w:sz w:val="18"/>
-              </w:rPr>
+            <w:r>
               <w:t>2.5</w:t>
             </w:r>
+            <w:r>
+              <w:rPr>
+                <w:sz w:val="18"/>
+              </w:rPr>
+            </w:r>
           </w:p>
         </w:tc>
         <w:tc>
@@ -6400,12 +6458,13 @@
             <w:tcW w:type="dxa" w:w="2880"/>
           </w:tcPr>
           <w:p>
-            <w:r/>
-            <w:r>
-              <w:rPr>
-                <w:sz w:val="18"/>
-              </w:rPr>
+            <w:r>
               <w:t>compara.py</w:t>
+            </w:r>
+            <w:r>
+              <w:rPr>
+                <w:sz w:val="18"/>
+              </w:rPr>
             </w:r>
           </w:p>
         </w:tc>
@@ -6890,6 +6949,102 @@
                 <w:sz w:val="18"/>
               </w:rPr>
               <w:t>app.py</w:t>
+            </w:r>
+          </w:p>
+        </w:tc>
+      </w:tr>
+      <w:tr>
+        <w:tc>
+          <w:tcPr>
+            <w:tcW w:type="dxa" w:w="2880"/>
+          </w:tcPr>
+          <w:p>
+            <w:r>
+              <w:t>Precisión de comparación de coordenadas</w:t>
+            </w:r>
+          </w:p>
+        </w:tc>
+        <w:tc>
+          <w:tcPr>
+            <w:tcW w:type="dxa" w:w="2880"/>
+          </w:tcPr>
+          <w:p>
+            <w:r>
+              <w:t>3 decimales</w:t>
+            </w:r>
+          </w:p>
+        </w:tc>
+        <w:tc>
+          <w:tcPr>
+            <w:tcW w:type="dxa" w:w="2880"/>
+          </w:tcPr>
+          <w:p>
+            <w:r>
+              <w:t>comparacion.py</w:t>
+            </w:r>
+          </w:p>
+        </w:tc>
+      </w:tr>
+      <w:tr>
+        <w:tc>
+          <w:tcPr>
+            <w:tcW w:type="dxa" w:w="2880"/>
+          </w:tcPr>
+          <w:p>
+            <w:r>
+              <w:t>Precisión de comparación de profundidad y magnitud</w:t>
+            </w:r>
+          </w:p>
+        </w:tc>
+        <w:tc>
+          <w:tcPr>
+            <w:tcW w:type="dxa" w:w="2880"/>
+          </w:tcPr>
+          <w:p>
+            <w:r>
+              <w:t>1 decimal</w:t>
+            </w:r>
+          </w:p>
+        </w:tc>
+        <w:tc>
+          <w:tcPr>
+            <w:tcW w:type="dxa" w:w="2880"/>
+          </w:tcPr>
+          <w:p>
+            <w:r>
+              <w:t>comparacion.py</w:t>
+            </w:r>
+          </w:p>
+        </w:tc>
+      </w:tr>
+      <w:tr>
+        <w:tc>
+          <w:tcPr>
+            <w:tcW w:type="dxa" w:w="2880"/>
+          </w:tcPr>
+          <w:p>
+            <w:r>
+              <w:t>Magnitud comparada como no actualizado</w:t>
+            </w:r>
+          </w:p>
+        </w:tc>
+        <w:tc>
+          <w:tcPr>
+            <w:tcW w:type="dxa" w:w="2880"/>
+          </w:tcPr>
+          <w:p>
+            <w:r>
+              <w:t>sí, a 1 decimal</w:t>
+            </w:r>
+          </w:p>
+        </w:tc>
+        <w:tc>
+          <w:tcPr>
+            <w:tcW w:type="dxa" w:w="2880"/>
+          </w:tcPr>
+          <w:p>
+            <w:r>
+              <w:t>compara.py, revisa_seiscomp.py</w:t>
             </w:r>
           </w:p>
         </w:tc>
@@ -7586,6 +7741,66 @@
       </w:pPr>
       <w:r>
         <w:t>No hay validación automática de que cada etapa haya producido los archivos que la siguiente espera; el usuario debe verificar los conteos del registro.</w:t>
+      </w:r>
+    </w:p>
+    <w:p>
+      <w:pPr>
+        <w:pStyle w:val="Heading1"/>
+      </w:pPr>
+      <w:r>
+        <w:t>16. Interfaz y catálogos (versión 1.1)</w:t>
+      </w:r>
+    </w:p>
+    <w:p>
+      <w:pPr>
+        <w:pStyle w:val="Heading2"/>
+      </w:pPr>
+      <w:r>
+        <w:t>16.1 Extracción tolerante</w:t>
+      </w:r>
+    </w:p>
+    <w:p>
+      <w:r>
+        <w:t>solicita_catalogos.py ya no corta si falla uno de los tres catálogos: intenta la conexión, la bajada de Seisan y de eventquery, y la exportación de SeisComp por separado, acumula las fallas y siempre abre app.py. El estado (período y catálogos faltantes) viaja como JSON en el tercer argumento de app.py, que lo usa para avisar y para habilitar la re-exportación del catálogo que corresponda. traer_seisan y traer_eventquery aceptan forzar=True para rebajar aunque el archivo exista.</w:t>
+      </w:r>
+    </w:p>
+    <w:p>
+      <w:pPr>
+        <w:pStyle w:val="Heading2"/>
+      </w:pPr>
+      <w:r>
+        <w:t>16.2 Menú de la ventana principal</w:t>
+      </w:r>
+    </w:p>
+    <w:p>
+      <w:r>
+        <w:t>La barra lateral se organiza en tres bloques: Procesar (el botón «Procesar catálogos»), Consultar («Ver repetidos» y los listados de «No publicados») y Re-exportar (Seisan / eventquery / SeisComp). De estos últimos solo se habilita el catálogo que falta o que cambió, según _estado_catalogo.</w:t>
+      </w:r>
+    </w:p>
+    <w:p>
+      <w:pPr>
+        <w:pStyle w:val="Heading2"/>
+      </w:pPr>
+      <w:r>
+        <w:t>16.3 Re-exportación y análisis obsoleto</w:t>
+      </w:r>
+    </w:p>
+    <w:p>
+      <w:r>
+        <w:t>SeisComp se re-exporta corriendo verifica_entorno.py y exporta_ventana_seiscomp.py, y luego se refresca solo su panel. Seisan y eventquery se vuelven a bajar por SSH con una contraseña que pide la aplicación. Como cambian los catálogos, _analisis_obsoleto() detecta que el insumo es más nuevo que el derivado (salida_collect.csv o new_2_&lt;base&gt;): no se muestran paneles con datos viejos y se ofrece reprocesar.</w:t>
+      </w:r>
+    </w:p>
+    <w:p>
+      <w:pPr>
+        <w:pStyle w:val="Heading2"/>
+      </w:pPr>
+      <w:r>
+        <w:t>16.4 Comparación numérica de parámetros</w:t>
+      </w:r>
+    </w:p>
+    <w:p>
+      <w:r>
+        <w:t>comparacion.py centraliza la comparación de latitud, longitud, profundidad y magnitud a la precisión del flujo. Reemplaza la comparación por texto, que marcaba como distinto el mismo valor escrito con distinta cantidad de decimales. La usan compara.py (para decidir el flag y escribir los informes) y revisa_seiscomp.py (para filtrar datos/atribucion_*.csv y armar la tabla de «No actualizados», que ahora incluye el valor publicado de cada parámetro y una columna con los que discrepan).</w:t>
       </w:r>
     </w:p>
     <w:sectPr>

</xml_diff>